<commit_message>
feat(p3): add meta-analytic positioning paragraph to §5 Discussion opening
Addresses reviewer critique that the theoretical delta vs. Wu et al. (2022) MIR
and Pisani et al. (2020) SMJ is not made explicit. New paragraph:
- Positions Vietnam as a within-country test of whether Wu/Fan/Chen (2022) pooled
  positive I-P for EMNEs masks functional-form nonlinearity at country level
- Engages explicitly with Pisani et al. (2020) cross-national skepticism and shows
  that single-country institutional context preserves the inverted-U
- Explains the participation-margin mechanism that cross-country meta-analyses
  would aggregate into an apparent continuous curvature

https://claude.ai/code/session_01GMFmEtt6FYiJ4MKzBNCLqb
</commit_message>
<xml_diff>
--- a/p3/submission/p3_vietnam_manuscript_blinded.docx
+++ b/p3/submission/p3_vietnam_manuscript_blinded.docx
@@ -17064,6 +17064,14 @@
       </w:pPr>
       <w:r>
         <w:t xml:space="preserve">5. Discussion</w:t>
+      </w:r>
+    </w:p>
+    <w:p>
+      <w:pPr>
+        <w:pStyle w:val="FirstParagraph"/>
+      </w:pPr>
+      <w:r>
+        <w:t xml:space="preserve">The results should first be located against the meta-analytic baseline. Wu, Fan, and Chen (2022, MIR) establish a positive average I–P relationship for emerging-market multinationals — a useful macro-level anchor, but one that aggregates across institutional contexts in which the functional form may vary substantially. Country-level heterogeneity in the I–P curve shape remains under-specified in that meta-analysis. Vietnam — as a single-party transitional economy with rapid but uneven digital infrastructure uptake — provides a critical test of whether the pooled meta-level estimate masks functional-form nonlinearity at the within-country level. The present evidence is consistent with that concern: the inverted-U is robust within Vietnam but is driven predominantly by a participation-margin step rather than by within-exporter saturation, a structure that pooling across exporters and non-exporters in cross-country meta-analyses would tend to inflate into an apparent continuous curvature. The within-Vietnam temporal durability of the threshold (39–46 % band sustained across 14 years) additionally confirms that institutional context — held constant in this single-country design — stabilises the curve shape in a way that cross-country designs cannot isolate. Our finding of a reproducible inverted-U at FSTS ≈ 39–46% in Vietnam, despite the cross-national skepticism articulated by Pisani, Garcia-Bernardo, and Heemskerk (2020, SMJ), is consistent with the view that single-country institutional contexts retain functional-form heterogeneity that pooled cross-national samples obscure through aggregation.</w:t>
       </w:r>
     </w:p>
     <w:bookmarkStart w:id="44" w:name="X45b04fa3b40d11388c7a41a1d622c5668243784"/>

</xml_diff>